<commit_message>
Name the signer under every signature line
Review of all signature blocks found several rules with no name beneath them
and two titles hardcoded to "Manager"/"Managing Member".

- Appointment of Trustee: the beneficiary and trustee rules had only the bare
  labels "Beneficiary" and "Trustee"; both now name the party
- Trust Agreement: the execution caption and the schedule acceptance caption
  hardcoded the title; both now use the signer's actual title
- Certification: reads "Signature of Trustee: Name, Title" rather than
  "Title: Name"

Page counts and the certification's one-page fit are unchanged.
</commit_message>
<xml_diff>
--- a/templates/Appointment of Trustee - TEMPLATE.docx
+++ b/templates/Appointment of Trustee - TEMPLATE.docx
@@ -223,7 +223,7 @@
         <w:tab/>
         <w:tab/>
         <w:tab/>
-        <w:t xml:space="preserve">  Beneficiary</w:t>
+        <w:t xml:space="preserve">{{BENEFICIARY_NAME}}, Beneficiary</w:t>
       </w:r>
       <w:r>
         <w:rPr>
@@ -393,7 +393,7 @@
         <w:tab/>
         <w:tab/>
         <w:tab/>
-        <w:t xml:space="preserve">                Trustee</w:t>
+        <w:t xml:space="preserve">{{TRUSTEE_NAME}}, Trustee</w:t>
       </w:r>
     </w:p>
     <w:p>

</xml_diff>